<commit_message>
Improve CTR letterhead/PDF layout, reception intake, and test coverage.
Harden GST wipe CLI to dummy/test GSTINs only; pytest cleanup unchanged.

Co-authored-by: Cursor <cursoragent@cursor.com>
</commit_message>
<xml_diff>
--- a/reference/protocol.docx
+++ b/reference/protocol.docx
@@ -1,6 +1,6 @@
 
 <file path=word/document.xml><?xml version="1.0" encoding="utf-8"?>
-<w:document xmlns:wpc="http://schemas.microsoft.com/office/word/2010/wordprocessingCanvas" xmlns:cx="http://schemas.microsoft.com/office/drawing/2014/chartex" xmlns:cx1="http://schemas.microsoft.com/office/drawing/2015/9/8/chartex" xmlns:cx2="http://schemas.microsoft.com/office/drawing/2015/10/21/chartex" xmlns:cx3="http://schemas.microsoft.com/office/drawing/2016/5/9/chartex" xmlns:cx4="http://schemas.microsoft.com/office/drawing/2016/5/10/chartex" xmlns:cx5="http://schemas.microsoft.com/office/drawing/2016/5/11/chartex" xmlns:cx6="http://schemas.microsoft.com/office/drawing/2016/5/12/chartex" xmlns:cx7="http://schemas.microsoft.com/office/drawing/2016/5/13/chartex" xmlns:cx8="http://schemas.microsoft.com/office/drawing/2016/5/14/chartex" xmlns:mc="http://schemas.openxmlformats.org/markup-compatibility/2006" xmlns:aink="http://schemas.microsoft.com/office/drawing/2016/ink" xmlns:am3d="http://schemas.microsoft.com/office/drawing/2017/model3d" xmlns:o="urn:schemas-microsoft-com:office:office" xmlns:oel="http://schemas.microsoft.com/office/2019/extlst" xmlns:r="http://schemas.openxmlformats.org/officeDocument/2006/relationships" xmlns:m="http://schemas.openxmlformats.org/officeDocument/2006/math" xmlns:v="urn:schemas-microsoft-com:vml" xmlns:wp14="http://schemas.microsoft.com/office/word/2010/wordprocessingDrawing" xmlns:wp="http://schemas.openxmlformats.org/drawingml/2006/wordprocessingDrawing" xmlns:w10="urn:schemas-microsoft-com:office:word" xmlns:w="http://schemas.openxmlformats.org/wordprocessingml/2006/main" xmlns:w14="http://schemas.microsoft.com/office/word/2010/wordml" xmlns:w15="http://schemas.microsoft.com/office/word/2012/wordml" xmlns:w16cex="http://schemas.microsoft.com/office/word/2018/wordml/cex" xmlns:w16cid="http://schemas.microsoft.com/office/word/2016/wordml/cid" xmlns:w16="http://schemas.microsoft.com/office/word/2018/wordml" xmlns:w16du="http://schemas.microsoft.com/office/word/2023/wordml/word16du" xmlns:w16sdtdh="http://schemas.microsoft.com/office/word/2020/wordml/sdtdatahash" xmlns:w16sdtfl="http://schemas.microsoft.com/office/word/2024/wordml/sdtformatlock" xmlns:w16se="http://schemas.microsoft.com/office/word/2015/wordml/symex" xmlns:wpg="http://schemas.microsoft.com/office/word/2010/wordprocessingGroup" xmlns:wpi="http://schemas.microsoft.com/office/word/2010/wordprocessingInk" xmlns:wne="http://schemas.microsoft.com/office/word/2006/wordml" xmlns:wps="http://schemas.microsoft.com/office/word/2010/wordprocessingShape" mc:Ignorable="w14 w15 w16se w16cid w16 w16cex w16sdtdh w16sdtfl w16du wp14">
+<w:document xmlns:wpc="http://schemas.microsoft.com/office/word/2010/wordprocessingCanvas" xmlns:mc="http://schemas.openxmlformats.org/markup-compatibility/2006" xmlns:o="urn:schemas-microsoft-com:office:office" xmlns:r="http://schemas.openxmlformats.org/officeDocument/2006/relationships" xmlns:m="http://schemas.openxmlformats.org/officeDocument/2006/math" xmlns:v="urn:schemas-microsoft-com:vml" xmlns:wp14="http://schemas.microsoft.com/office/word/2010/wordprocessingDrawing" xmlns:wp="http://schemas.openxmlformats.org/drawingml/2006/wordprocessingDrawing" xmlns:w10="urn:schemas-microsoft-com:office:word" xmlns:w="http://schemas.openxmlformats.org/wordprocessingml/2006/main" xmlns:w14="http://schemas.microsoft.com/office/word/2010/wordml" xmlns:w15="http://schemas.microsoft.com/office/word/2012/wordml" xmlns:wpg="http://schemas.microsoft.com/office/word/2010/wordprocessingGroup" xmlns:wpi="http://schemas.microsoft.com/office/word/2010/wordprocessingInk" xmlns:wne="http://schemas.microsoft.com/office/word/2006/wordml" xmlns:wps="http://schemas.microsoft.com/office/word/2010/wordprocessingShape" mc:Ignorable="w14 w15 wp14">
   <w:body>
     <w:p>
       <w:pPr>
@@ -193,7 +193,7 @@
 </file>
 
 <file path=word/endnotes.xml><?xml version="1.0" encoding="utf-8"?>
-<w:endnotes xmlns:wpc="http://schemas.microsoft.com/office/word/2010/wordprocessingCanvas" xmlns:cx="http://schemas.microsoft.com/office/drawing/2014/chartex" xmlns:cx1="http://schemas.microsoft.com/office/drawing/2015/9/8/chartex" xmlns:cx2="http://schemas.microsoft.com/office/drawing/2015/10/21/chartex" xmlns:cx3="http://schemas.microsoft.com/office/drawing/2016/5/9/chartex" xmlns:cx4="http://schemas.microsoft.com/office/drawing/2016/5/10/chartex" xmlns:cx5="http://schemas.microsoft.com/office/drawing/2016/5/11/chartex" xmlns:cx6="http://schemas.microsoft.com/office/drawing/2016/5/12/chartex" xmlns:cx7="http://schemas.microsoft.com/office/drawing/2016/5/13/chartex" xmlns:cx8="http://schemas.microsoft.com/office/drawing/2016/5/14/chartex" xmlns:mc="http://schemas.openxmlformats.org/markup-compatibility/2006" xmlns:aink="http://schemas.microsoft.com/office/drawing/2016/ink" xmlns:am3d="http://schemas.microsoft.com/office/drawing/2017/model3d" xmlns:o="urn:schemas-microsoft-com:office:office" xmlns:oel="http://schemas.microsoft.com/office/2019/extlst" xmlns:r="http://schemas.openxmlformats.org/officeDocument/2006/relationships" xmlns:m="http://schemas.openxmlformats.org/officeDocument/2006/math" xmlns:v="urn:schemas-microsoft-com:vml" xmlns:wp14="http://schemas.microsoft.com/office/word/2010/wordprocessingDrawing" xmlns:wp="http://schemas.openxmlformats.org/drawingml/2006/wordprocessingDrawing" xmlns:w10="urn:schemas-microsoft-com:office:word" xmlns:w="http://schemas.openxmlformats.org/wordprocessingml/2006/main" xmlns:w14="http://schemas.microsoft.com/office/word/2010/wordml" xmlns:w15="http://schemas.microsoft.com/office/word/2012/wordml" xmlns:w16cex="http://schemas.microsoft.com/office/word/2018/wordml/cex" xmlns:w16cid="http://schemas.microsoft.com/office/word/2016/wordml/cid" xmlns:w16="http://schemas.microsoft.com/office/word/2018/wordml" xmlns:w16du="http://schemas.microsoft.com/office/word/2023/wordml/word16du" xmlns:w16sdtdh="http://schemas.microsoft.com/office/word/2020/wordml/sdtdatahash" xmlns:w16sdtfl="http://schemas.microsoft.com/office/word/2024/wordml/sdtformatlock" xmlns:w16se="http://schemas.microsoft.com/office/word/2015/wordml/symex" xmlns:wpg="http://schemas.microsoft.com/office/word/2010/wordprocessingGroup" xmlns:wpi="http://schemas.microsoft.com/office/word/2010/wordprocessingInk" xmlns:wne="http://schemas.microsoft.com/office/word/2006/wordml" xmlns:wps="http://schemas.microsoft.com/office/word/2010/wordprocessingShape" mc:Ignorable="w14 w15 w16se w16cid w16 w16cex w16sdtdh w16sdtfl w16du wp14">
+<w:endnotes xmlns:wpc="http://schemas.microsoft.com/office/word/2010/wordprocessingCanvas" xmlns:mc="http://schemas.openxmlformats.org/markup-compatibility/2006" xmlns:o="urn:schemas-microsoft-com:office:office" xmlns:r="http://schemas.openxmlformats.org/officeDocument/2006/relationships" xmlns:m="http://schemas.openxmlformats.org/officeDocument/2006/math" xmlns:v="urn:schemas-microsoft-com:vml" xmlns:wp14="http://schemas.microsoft.com/office/word/2010/wordprocessingDrawing" xmlns:wp="http://schemas.openxmlformats.org/drawingml/2006/wordprocessingDrawing" xmlns:w10="urn:schemas-microsoft-com:office:word" xmlns:w="http://schemas.openxmlformats.org/wordprocessingml/2006/main" xmlns:w14="http://schemas.microsoft.com/office/word/2010/wordml" xmlns:w15="http://schemas.microsoft.com/office/word/2012/wordml" xmlns:wpg="http://schemas.microsoft.com/office/word/2010/wordprocessingGroup" xmlns:wpi="http://schemas.microsoft.com/office/word/2010/wordprocessingInk" xmlns:wne="http://schemas.microsoft.com/office/word/2006/wordml" xmlns:wps="http://schemas.microsoft.com/office/word/2010/wordprocessingShape" mc:Ignorable="w14 w15 wp14">
   <w:endnote w:type="separator" w:id="-1">
     <w:p>
       <w:pPr>
@@ -218,7 +218,7 @@
 </file>
 
 <file path=word/footer1.xml><?xml version="1.0" encoding="utf-8"?>
-<w:ftr xmlns:wpc="http://schemas.microsoft.com/office/word/2010/wordprocessingCanvas" xmlns:cx="http://schemas.microsoft.com/office/drawing/2014/chartex" xmlns:cx1="http://schemas.microsoft.com/office/drawing/2015/9/8/chartex" xmlns:cx2="http://schemas.microsoft.com/office/drawing/2015/10/21/chartex" xmlns:cx3="http://schemas.microsoft.com/office/drawing/2016/5/9/chartex" xmlns:cx4="http://schemas.microsoft.com/office/drawing/2016/5/10/chartex" xmlns:cx5="http://schemas.microsoft.com/office/drawing/2016/5/11/chartex" xmlns:cx6="http://schemas.microsoft.com/office/drawing/2016/5/12/chartex" xmlns:cx7="http://schemas.microsoft.com/office/drawing/2016/5/13/chartex" xmlns:cx8="http://schemas.microsoft.com/office/drawing/2016/5/14/chartex" xmlns:mc="http://schemas.openxmlformats.org/markup-compatibility/2006" xmlns:aink="http://schemas.microsoft.com/office/drawing/2016/ink" xmlns:am3d="http://schemas.microsoft.com/office/drawing/2017/model3d" xmlns:o="urn:schemas-microsoft-com:office:office" xmlns:oel="http://schemas.microsoft.com/office/2019/extlst" xmlns:r="http://schemas.openxmlformats.org/officeDocument/2006/relationships" xmlns:m="http://schemas.openxmlformats.org/officeDocument/2006/math" xmlns:v="urn:schemas-microsoft-com:vml" xmlns:wp14="http://schemas.microsoft.com/office/word/2010/wordprocessingDrawing" xmlns:wp="http://schemas.openxmlformats.org/drawingml/2006/wordprocessingDrawing" xmlns:w10="urn:schemas-microsoft-com:office:word" xmlns:w="http://schemas.openxmlformats.org/wordprocessingml/2006/main" xmlns:w14="http://schemas.microsoft.com/office/word/2010/wordml" xmlns:w15="http://schemas.microsoft.com/office/word/2012/wordml" xmlns:w16cex="http://schemas.microsoft.com/office/word/2018/wordml/cex" xmlns:w16cid="http://schemas.microsoft.com/office/word/2016/wordml/cid" xmlns:w16="http://schemas.microsoft.com/office/word/2018/wordml" xmlns:w16du="http://schemas.microsoft.com/office/word/2023/wordml/word16du" xmlns:w16sdtdh="http://schemas.microsoft.com/office/word/2020/wordml/sdtdatahash" xmlns:w16sdtfl="http://schemas.microsoft.com/office/word/2024/wordml/sdtformatlock" xmlns:w16se="http://schemas.microsoft.com/office/word/2015/wordml/symex" xmlns:wpg="http://schemas.microsoft.com/office/word/2010/wordprocessingGroup" xmlns:wpi="http://schemas.microsoft.com/office/word/2010/wordprocessingInk" xmlns:wne="http://schemas.microsoft.com/office/word/2006/wordml" xmlns:wps="http://schemas.microsoft.com/office/word/2010/wordprocessingShape" mc:Ignorable="w14 w15 w16se w16cid w16 w16cex w16sdtdh w16sdtfl w16du wp14">
+<w:ftr xmlns:wpc="http://schemas.microsoft.com/office/word/2010/wordprocessingCanvas" xmlns:mc="http://schemas.openxmlformats.org/markup-compatibility/2006" xmlns:o="urn:schemas-microsoft-com:office:office" xmlns:r="http://schemas.openxmlformats.org/officeDocument/2006/relationships" xmlns:m="http://schemas.openxmlformats.org/officeDocument/2006/math" xmlns:v="urn:schemas-microsoft-com:vml" xmlns:wp14="http://schemas.microsoft.com/office/word/2010/wordprocessingDrawing" xmlns:wp="http://schemas.openxmlformats.org/drawingml/2006/wordprocessingDrawing" xmlns:w10="urn:schemas-microsoft-com:office:word" xmlns:w="http://schemas.openxmlformats.org/wordprocessingml/2006/main" xmlns:w14="http://schemas.microsoft.com/office/word/2010/wordml" xmlns:w15="http://schemas.microsoft.com/office/word/2012/wordml" xmlns:wpg="http://schemas.microsoft.com/office/word/2010/wordprocessingGroup" xmlns:wpi="http://schemas.microsoft.com/office/word/2010/wordprocessingInk" xmlns:wne="http://schemas.microsoft.com/office/word/2006/wordml" xmlns:wps="http://schemas.microsoft.com/office/word/2010/wordprocessingShape" mc:Ignorable="w14 w15 wp14">
   <w:p>
     <w:pPr>
       <w:pStyle w:val="Footer"/>
@@ -228,7 +228,7 @@
 </file>
 
 <file path=word/footer2.xml><?xml version="1.0" encoding="utf-8"?>
-<w:ftr xmlns:wpc="http://schemas.microsoft.com/office/word/2010/wordprocessingCanvas" xmlns:cx="http://schemas.microsoft.com/office/drawing/2014/chartex" xmlns:cx1="http://schemas.microsoft.com/office/drawing/2015/9/8/chartex" xmlns:cx2="http://schemas.microsoft.com/office/drawing/2015/10/21/chartex" xmlns:cx3="http://schemas.microsoft.com/office/drawing/2016/5/9/chartex" xmlns:cx4="http://schemas.microsoft.com/office/drawing/2016/5/10/chartex" xmlns:cx5="http://schemas.microsoft.com/office/drawing/2016/5/11/chartex" xmlns:cx6="http://schemas.microsoft.com/office/drawing/2016/5/12/chartex" xmlns:cx7="http://schemas.microsoft.com/office/drawing/2016/5/13/chartex" xmlns:cx8="http://schemas.microsoft.com/office/drawing/2016/5/14/chartex" xmlns:mc="http://schemas.openxmlformats.org/markup-compatibility/2006" xmlns:aink="http://schemas.microsoft.com/office/drawing/2016/ink" xmlns:am3d="http://schemas.microsoft.com/office/drawing/2017/model3d" xmlns:o="urn:schemas-microsoft-com:office:office" xmlns:oel="http://schemas.microsoft.com/office/2019/extlst" xmlns:r="http://schemas.openxmlformats.org/officeDocument/2006/relationships" xmlns:m="http://schemas.openxmlformats.org/officeDocument/2006/math" xmlns:v="urn:schemas-microsoft-com:vml" xmlns:wp14="http://schemas.microsoft.com/office/word/2010/wordprocessingDrawing" xmlns:wp="http://schemas.openxmlformats.org/drawingml/2006/wordprocessingDrawing" xmlns:w10="urn:schemas-microsoft-com:office:word" xmlns:w="http://schemas.openxmlformats.org/wordprocessingml/2006/main" xmlns:w14="http://schemas.microsoft.com/office/word/2010/wordml" xmlns:w15="http://schemas.microsoft.com/office/word/2012/wordml" xmlns:w16cex="http://schemas.microsoft.com/office/word/2018/wordml/cex" xmlns:w16cid="http://schemas.microsoft.com/office/word/2016/wordml/cid" xmlns:w16="http://schemas.microsoft.com/office/word/2018/wordml" xmlns:w16du="http://schemas.microsoft.com/office/word/2023/wordml/word16du" xmlns:w16sdtdh="http://schemas.microsoft.com/office/word/2020/wordml/sdtdatahash" xmlns:w16sdtfl="http://schemas.microsoft.com/office/word/2024/wordml/sdtformatlock" xmlns:w16se="http://schemas.microsoft.com/office/word/2015/wordml/symex" xmlns:wpg="http://schemas.microsoft.com/office/word/2010/wordprocessingGroup" xmlns:wpi="http://schemas.microsoft.com/office/word/2010/wordprocessingInk" xmlns:wne="http://schemas.microsoft.com/office/word/2006/wordml" xmlns:wps="http://schemas.microsoft.com/office/word/2010/wordprocessingShape" mc:Ignorable="w14 w15 w16se w16cid w16 w16cex w16sdtdh w16sdtfl w16du wp14">
+<w:ftr xmlns:wpc="http://schemas.microsoft.com/office/word/2010/wordprocessingCanvas" xmlns:mc="http://schemas.openxmlformats.org/markup-compatibility/2006" xmlns:o="urn:schemas-microsoft-com:office:office" xmlns:r="http://schemas.openxmlformats.org/officeDocument/2006/relationships" xmlns:m="http://schemas.openxmlformats.org/officeDocument/2006/math" xmlns:v="urn:schemas-microsoft-com:vml" xmlns:wp14="http://schemas.microsoft.com/office/word/2010/wordprocessingDrawing" xmlns:wp="http://schemas.openxmlformats.org/drawingml/2006/wordprocessingDrawing" xmlns:w10="urn:schemas-microsoft-com:office:word" xmlns:w="http://schemas.openxmlformats.org/wordprocessingml/2006/main" xmlns:w14="http://schemas.microsoft.com/office/word/2010/wordml" xmlns:w15="http://schemas.microsoft.com/office/word/2012/wordml" xmlns:wpg="http://schemas.microsoft.com/office/word/2010/wordprocessingGroup" xmlns:wpi="http://schemas.microsoft.com/office/word/2010/wordprocessingInk" xmlns:wne="http://schemas.microsoft.com/office/word/2006/wordml" xmlns:wps="http://schemas.microsoft.com/office/word/2010/wordprocessingShape" mc:Ignorable="w14 w15 wp14">
   <w:tbl>
     <w:tblPr>
       <w:tblStyle w:val="TableGrid"/>
@@ -343,23 +343,7 @@
               <w:rFonts w:asciiTheme="majorHAnsi" w:hAnsiTheme="majorHAnsi"/>
               <w:b/>
             </w:rPr>
-            <w:t xml:space="preserve">Reviewed &amp; </w:t>
-          </w:r>
-          <w:proofErr w:type="gramStart"/>
-          <w:r>
-            <w:rPr>
-              <w:rFonts w:asciiTheme="majorHAnsi" w:hAnsiTheme="majorHAnsi"/>
-              <w:b/>
-            </w:rPr>
-            <w:t>Issued  by</w:t>
-          </w:r>
-          <w:proofErr w:type="gramEnd"/>
-          <w:r>
-            <w:rPr>
-              <w:rFonts w:asciiTheme="majorHAnsi" w:hAnsiTheme="majorHAnsi"/>
-              <w:b/>
-            </w:rPr>
-            <w:t xml:space="preserve">: </w:t>
+            <w:t xml:space="preserve">Reviewed &amp; Issued  by: </w:t>
           </w:r>
         </w:p>
       </w:tc>
@@ -457,7 +441,7 @@
             <w:rPr>
               <w:rFonts w:asciiTheme="majorHAnsi" w:hAnsiTheme="majorHAnsi"/>
               <w:noProof/>
-              <w:lang w:val="en-IN" w:eastAsia="en-IN"/>
+              <w:lang w:val="en-IN" w:eastAsia="en-IN" w:bidi="mr-IN"/>
             </w:rPr>
             <w:drawing>
               <wp:inline distT="0" distB="0" distL="0" distR="0" wp14:anchorId="6FCF6F74" wp14:editId="03F398F3">
@@ -543,7 +527,7 @@
 </file>
 
 <file path=word/footer3.xml><?xml version="1.0" encoding="utf-8"?>
-<w:ftr xmlns:wpc="http://schemas.microsoft.com/office/word/2010/wordprocessingCanvas" xmlns:cx="http://schemas.microsoft.com/office/drawing/2014/chartex" xmlns:cx1="http://schemas.microsoft.com/office/drawing/2015/9/8/chartex" xmlns:cx2="http://schemas.microsoft.com/office/drawing/2015/10/21/chartex" xmlns:cx3="http://schemas.microsoft.com/office/drawing/2016/5/9/chartex" xmlns:cx4="http://schemas.microsoft.com/office/drawing/2016/5/10/chartex" xmlns:cx5="http://schemas.microsoft.com/office/drawing/2016/5/11/chartex" xmlns:cx6="http://schemas.microsoft.com/office/drawing/2016/5/12/chartex" xmlns:cx7="http://schemas.microsoft.com/office/drawing/2016/5/13/chartex" xmlns:cx8="http://schemas.microsoft.com/office/drawing/2016/5/14/chartex" xmlns:mc="http://schemas.openxmlformats.org/markup-compatibility/2006" xmlns:aink="http://schemas.microsoft.com/office/drawing/2016/ink" xmlns:am3d="http://schemas.microsoft.com/office/drawing/2017/model3d" xmlns:o="urn:schemas-microsoft-com:office:office" xmlns:oel="http://schemas.microsoft.com/office/2019/extlst" xmlns:r="http://schemas.openxmlformats.org/officeDocument/2006/relationships" xmlns:m="http://schemas.openxmlformats.org/officeDocument/2006/math" xmlns:v="urn:schemas-microsoft-com:vml" xmlns:wp14="http://schemas.microsoft.com/office/word/2010/wordprocessingDrawing" xmlns:wp="http://schemas.openxmlformats.org/drawingml/2006/wordprocessingDrawing" xmlns:w10="urn:schemas-microsoft-com:office:word" xmlns:w="http://schemas.openxmlformats.org/wordprocessingml/2006/main" xmlns:w14="http://schemas.microsoft.com/office/word/2010/wordml" xmlns:w15="http://schemas.microsoft.com/office/word/2012/wordml" xmlns:w16cex="http://schemas.microsoft.com/office/word/2018/wordml/cex" xmlns:w16cid="http://schemas.microsoft.com/office/word/2016/wordml/cid" xmlns:w16="http://schemas.microsoft.com/office/word/2018/wordml" xmlns:w16du="http://schemas.microsoft.com/office/word/2023/wordml/word16du" xmlns:w16sdtdh="http://schemas.microsoft.com/office/word/2020/wordml/sdtdatahash" xmlns:w16sdtfl="http://schemas.microsoft.com/office/word/2024/wordml/sdtformatlock" xmlns:w16se="http://schemas.microsoft.com/office/word/2015/wordml/symex" xmlns:wpg="http://schemas.microsoft.com/office/word/2010/wordprocessingGroup" xmlns:wpi="http://schemas.microsoft.com/office/word/2010/wordprocessingInk" xmlns:wne="http://schemas.microsoft.com/office/word/2006/wordml" xmlns:wps="http://schemas.microsoft.com/office/word/2010/wordprocessingShape" mc:Ignorable="w14 w15 w16se w16cid w16 w16cex w16sdtdh w16sdtfl w16du wp14">
+<w:ftr xmlns:wpc="http://schemas.microsoft.com/office/word/2010/wordprocessingCanvas" xmlns:mc="http://schemas.openxmlformats.org/markup-compatibility/2006" xmlns:o="urn:schemas-microsoft-com:office:office" xmlns:r="http://schemas.openxmlformats.org/officeDocument/2006/relationships" xmlns:m="http://schemas.openxmlformats.org/officeDocument/2006/math" xmlns:v="urn:schemas-microsoft-com:vml" xmlns:wp14="http://schemas.microsoft.com/office/word/2010/wordprocessingDrawing" xmlns:wp="http://schemas.openxmlformats.org/drawingml/2006/wordprocessingDrawing" xmlns:w10="urn:schemas-microsoft-com:office:word" xmlns:w="http://schemas.openxmlformats.org/wordprocessingml/2006/main" xmlns:w14="http://schemas.microsoft.com/office/word/2010/wordml" xmlns:w15="http://schemas.microsoft.com/office/word/2012/wordml" xmlns:wpg="http://schemas.microsoft.com/office/word/2010/wordprocessingGroup" xmlns:wpi="http://schemas.microsoft.com/office/word/2010/wordprocessingInk" xmlns:wne="http://schemas.microsoft.com/office/word/2006/wordml" xmlns:wps="http://schemas.microsoft.com/office/word/2010/wordprocessingShape" mc:Ignorable="w14 w15 wp14">
   <w:p>
     <w:pPr>
       <w:pStyle w:val="Footer"/>
@@ -553,7 +537,7 @@
 </file>
 
 <file path=word/footnotes.xml><?xml version="1.0" encoding="utf-8"?>
-<w:footnotes xmlns:wpc="http://schemas.microsoft.com/office/word/2010/wordprocessingCanvas" xmlns:cx="http://schemas.microsoft.com/office/drawing/2014/chartex" xmlns:cx1="http://schemas.microsoft.com/office/drawing/2015/9/8/chartex" xmlns:cx2="http://schemas.microsoft.com/office/drawing/2015/10/21/chartex" xmlns:cx3="http://schemas.microsoft.com/office/drawing/2016/5/9/chartex" xmlns:cx4="http://schemas.microsoft.com/office/drawing/2016/5/10/chartex" xmlns:cx5="http://schemas.microsoft.com/office/drawing/2016/5/11/chartex" xmlns:cx6="http://schemas.microsoft.com/office/drawing/2016/5/12/chartex" xmlns:cx7="http://schemas.microsoft.com/office/drawing/2016/5/13/chartex" xmlns:cx8="http://schemas.microsoft.com/office/drawing/2016/5/14/chartex" xmlns:mc="http://schemas.openxmlformats.org/markup-compatibility/2006" xmlns:aink="http://schemas.microsoft.com/office/drawing/2016/ink" xmlns:am3d="http://schemas.microsoft.com/office/drawing/2017/model3d" xmlns:o="urn:schemas-microsoft-com:office:office" xmlns:oel="http://schemas.microsoft.com/office/2019/extlst" xmlns:r="http://schemas.openxmlformats.org/officeDocument/2006/relationships" xmlns:m="http://schemas.openxmlformats.org/officeDocument/2006/math" xmlns:v="urn:schemas-microsoft-com:vml" xmlns:wp14="http://schemas.microsoft.com/office/word/2010/wordprocessingDrawing" xmlns:wp="http://schemas.openxmlformats.org/drawingml/2006/wordprocessingDrawing" xmlns:w10="urn:schemas-microsoft-com:office:word" xmlns:w="http://schemas.openxmlformats.org/wordprocessingml/2006/main" xmlns:w14="http://schemas.microsoft.com/office/word/2010/wordml" xmlns:w15="http://schemas.microsoft.com/office/word/2012/wordml" xmlns:w16cex="http://schemas.microsoft.com/office/word/2018/wordml/cex" xmlns:w16cid="http://schemas.microsoft.com/office/word/2016/wordml/cid" xmlns:w16="http://schemas.microsoft.com/office/word/2018/wordml" xmlns:w16du="http://schemas.microsoft.com/office/word/2023/wordml/word16du" xmlns:w16sdtdh="http://schemas.microsoft.com/office/word/2020/wordml/sdtdatahash" xmlns:w16sdtfl="http://schemas.microsoft.com/office/word/2024/wordml/sdtformatlock" xmlns:w16se="http://schemas.microsoft.com/office/word/2015/wordml/symex" xmlns:wpg="http://schemas.microsoft.com/office/word/2010/wordprocessingGroup" xmlns:wpi="http://schemas.microsoft.com/office/word/2010/wordprocessingInk" xmlns:wne="http://schemas.microsoft.com/office/word/2006/wordml" xmlns:wps="http://schemas.microsoft.com/office/word/2010/wordprocessingShape" mc:Ignorable="w14 w15 w16se w16cid w16 w16cex w16sdtdh w16sdtfl w16du wp14">
+<w:footnotes xmlns:wpc="http://schemas.microsoft.com/office/word/2010/wordprocessingCanvas" xmlns:mc="http://schemas.openxmlformats.org/markup-compatibility/2006" xmlns:o="urn:schemas-microsoft-com:office:office" xmlns:r="http://schemas.openxmlformats.org/officeDocument/2006/relationships" xmlns:m="http://schemas.openxmlformats.org/officeDocument/2006/math" xmlns:v="urn:schemas-microsoft-com:vml" xmlns:wp14="http://schemas.microsoft.com/office/word/2010/wordprocessingDrawing" xmlns:wp="http://schemas.openxmlformats.org/drawingml/2006/wordprocessingDrawing" xmlns:w10="urn:schemas-microsoft-com:office:word" xmlns:w="http://schemas.openxmlformats.org/wordprocessingml/2006/main" xmlns:w14="http://schemas.microsoft.com/office/word/2010/wordml" xmlns:w15="http://schemas.microsoft.com/office/word/2012/wordml" xmlns:wpg="http://schemas.microsoft.com/office/word/2010/wordprocessingGroup" xmlns:wpi="http://schemas.microsoft.com/office/word/2010/wordprocessingInk" xmlns:wne="http://schemas.microsoft.com/office/word/2006/wordml" xmlns:wps="http://schemas.microsoft.com/office/word/2010/wordprocessingShape" mc:Ignorable="w14 w15 wp14">
   <w:footnote w:type="separator" w:id="-1">
     <w:p>
       <w:pPr>
@@ -578,7 +562,7 @@
 </file>
 
 <file path=word/header1.xml><?xml version="1.0" encoding="utf-8"?>
-<w:hdr xmlns:wpc="http://schemas.microsoft.com/office/word/2010/wordprocessingCanvas" xmlns:cx="http://schemas.microsoft.com/office/drawing/2014/chartex" xmlns:cx1="http://schemas.microsoft.com/office/drawing/2015/9/8/chartex" xmlns:cx2="http://schemas.microsoft.com/office/drawing/2015/10/21/chartex" xmlns:cx3="http://schemas.microsoft.com/office/drawing/2016/5/9/chartex" xmlns:cx4="http://schemas.microsoft.com/office/drawing/2016/5/10/chartex" xmlns:cx5="http://schemas.microsoft.com/office/drawing/2016/5/11/chartex" xmlns:cx6="http://schemas.microsoft.com/office/drawing/2016/5/12/chartex" xmlns:cx7="http://schemas.microsoft.com/office/drawing/2016/5/13/chartex" xmlns:cx8="http://schemas.microsoft.com/office/drawing/2016/5/14/chartex" xmlns:mc="http://schemas.openxmlformats.org/markup-compatibility/2006" xmlns:aink="http://schemas.microsoft.com/office/drawing/2016/ink" xmlns:am3d="http://schemas.microsoft.com/office/drawing/2017/model3d" xmlns:o="urn:schemas-microsoft-com:office:office" xmlns:oel="http://schemas.microsoft.com/office/2019/extlst" xmlns:r="http://schemas.openxmlformats.org/officeDocument/2006/relationships" xmlns:m="http://schemas.openxmlformats.org/officeDocument/2006/math" xmlns:v="urn:schemas-microsoft-com:vml" xmlns:wp14="http://schemas.microsoft.com/office/word/2010/wordprocessingDrawing" xmlns:wp="http://schemas.openxmlformats.org/drawingml/2006/wordprocessingDrawing" xmlns:w10="urn:schemas-microsoft-com:office:word" xmlns:w="http://schemas.openxmlformats.org/wordprocessingml/2006/main" xmlns:w14="http://schemas.microsoft.com/office/word/2010/wordml" xmlns:w15="http://schemas.microsoft.com/office/word/2012/wordml" xmlns:w16cex="http://schemas.microsoft.com/office/word/2018/wordml/cex" xmlns:w16cid="http://schemas.microsoft.com/office/word/2016/wordml/cid" xmlns:w16="http://schemas.microsoft.com/office/word/2018/wordml" xmlns:w16du="http://schemas.microsoft.com/office/word/2023/wordml/word16du" xmlns:w16sdtdh="http://schemas.microsoft.com/office/word/2020/wordml/sdtdatahash" xmlns:w16sdtfl="http://schemas.microsoft.com/office/word/2024/wordml/sdtformatlock" xmlns:w16se="http://schemas.microsoft.com/office/word/2015/wordml/symex" xmlns:wpg="http://schemas.microsoft.com/office/word/2010/wordprocessingGroup" xmlns:wpi="http://schemas.microsoft.com/office/word/2010/wordprocessingInk" xmlns:wne="http://schemas.microsoft.com/office/word/2006/wordml" xmlns:wps="http://schemas.microsoft.com/office/word/2010/wordprocessingShape" mc:Ignorable="w14 w15 w16se w16cid w16 w16cex w16sdtdh w16sdtfl w16du wp14">
+<w:hdr xmlns:wpc="http://schemas.microsoft.com/office/word/2010/wordprocessingCanvas" xmlns:mc="http://schemas.openxmlformats.org/markup-compatibility/2006" xmlns:o="urn:schemas-microsoft-com:office:office" xmlns:r="http://schemas.openxmlformats.org/officeDocument/2006/relationships" xmlns:m="http://schemas.openxmlformats.org/officeDocument/2006/math" xmlns:v="urn:schemas-microsoft-com:vml" xmlns:wp14="http://schemas.microsoft.com/office/word/2010/wordprocessingDrawing" xmlns:wp="http://schemas.openxmlformats.org/drawingml/2006/wordprocessingDrawing" xmlns:w10="urn:schemas-microsoft-com:office:word" xmlns:w="http://schemas.openxmlformats.org/wordprocessingml/2006/main" xmlns:w14="http://schemas.microsoft.com/office/word/2010/wordml" xmlns:w15="http://schemas.microsoft.com/office/word/2012/wordml" xmlns:wpg="http://schemas.microsoft.com/office/word/2010/wordprocessingGroup" xmlns:wpi="http://schemas.microsoft.com/office/word/2010/wordprocessingInk" xmlns:wne="http://schemas.microsoft.com/office/word/2006/wordml" xmlns:wps="http://schemas.microsoft.com/office/word/2010/wordprocessingShape" mc:Ignorable="w14 w15 wp14">
   <w:p>
     <w:pPr>
       <w:pStyle w:val="Header"/>
@@ -588,10 +572,10 @@
 </file>
 
 <file path=word/header2.xml><?xml version="1.0" encoding="utf-8"?>
-<w:hdr xmlns:wpc="http://schemas.microsoft.com/office/word/2010/wordprocessingCanvas" xmlns:cx="http://schemas.microsoft.com/office/drawing/2014/chartex" xmlns:cx1="http://schemas.microsoft.com/office/drawing/2015/9/8/chartex" xmlns:cx2="http://schemas.microsoft.com/office/drawing/2015/10/21/chartex" xmlns:cx3="http://schemas.microsoft.com/office/drawing/2016/5/9/chartex" xmlns:cx4="http://schemas.microsoft.com/office/drawing/2016/5/10/chartex" xmlns:cx5="http://schemas.microsoft.com/office/drawing/2016/5/11/chartex" xmlns:cx6="http://schemas.microsoft.com/office/drawing/2016/5/12/chartex" xmlns:cx7="http://schemas.microsoft.com/office/drawing/2016/5/13/chartex" xmlns:cx8="http://schemas.microsoft.com/office/drawing/2016/5/14/chartex" xmlns:mc="http://schemas.openxmlformats.org/markup-compatibility/2006" xmlns:aink="http://schemas.microsoft.com/office/drawing/2016/ink" xmlns:am3d="http://schemas.microsoft.com/office/drawing/2017/model3d" xmlns:o="urn:schemas-microsoft-com:office:office" xmlns:oel="http://schemas.microsoft.com/office/2019/extlst" xmlns:r="http://schemas.openxmlformats.org/officeDocument/2006/relationships" xmlns:m="http://schemas.openxmlformats.org/officeDocument/2006/math" xmlns:v="urn:schemas-microsoft-com:vml" xmlns:wp14="http://schemas.microsoft.com/office/word/2010/wordprocessingDrawing" xmlns:wp="http://schemas.openxmlformats.org/drawingml/2006/wordprocessingDrawing" xmlns:w10="urn:schemas-microsoft-com:office:word" xmlns:w="http://schemas.openxmlformats.org/wordprocessingml/2006/main" xmlns:w14="http://schemas.microsoft.com/office/word/2010/wordml" xmlns:w15="http://schemas.microsoft.com/office/word/2012/wordml" xmlns:w16cex="http://schemas.microsoft.com/office/word/2018/wordml/cex" xmlns:w16cid="http://schemas.microsoft.com/office/word/2016/wordml/cid" xmlns:w16="http://schemas.microsoft.com/office/word/2018/wordml" xmlns:w16du="http://schemas.microsoft.com/office/word/2023/wordml/word16du" xmlns:w16sdtdh="http://schemas.microsoft.com/office/word/2020/wordml/sdtdatahash" xmlns:w16sdtfl="http://schemas.microsoft.com/office/word/2024/wordml/sdtformatlock" xmlns:w16se="http://schemas.microsoft.com/office/word/2015/wordml/symex" xmlns:wpg="http://schemas.microsoft.com/office/word/2010/wordprocessingGroup" xmlns:wpi="http://schemas.microsoft.com/office/word/2010/wordprocessingInk" xmlns:wne="http://schemas.microsoft.com/office/word/2006/wordml" xmlns:wps="http://schemas.microsoft.com/office/word/2010/wordprocessingShape" mc:Ignorable="w14 w15 w16se w16cid w16 w16cex w16sdtdh w16sdtfl w16du wp14">
+<w:hdr xmlns:wpc="http://schemas.microsoft.com/office/word/2010/wordprocessingCanvas" xmlns:mc="http://schemas.openxmlformats.org/markup-compatibility/2006" xmlns:o="urn:schemas-microsoft-com:office:office" xmlns:r="http://schemas.openxmlformats.org/officeDocument/2006/relationships" xmlns:m="http://schemas.openxmlformats.org/officeDocument/2006/math" xmlns:v="urn:schemas-microsoft-com:vml" xmlns:wp14="http://schemas.microsoft.com/office/word/2010/wordprocessingDrawing" xmlns:wp="http://schemas.openxmlformats.org/drawingml/2006/wordprocessingDrawing" xmlns:w10="urn:schemas-microsoft-com:office:word" xmlns:w="http://schemas.openxmlformats.org/wordprocessingml/2006/main" xmlns:w14="http://schemas.microsoft.com/office/word/2010/wordml" xmlns:w15="http://schemas.microsoft.com/office/word/2012/wordml" xmlns:wpg="http://schemas.microsoft.com/office/word/2010/wordprocessingGroup" xmlns:wpi="http://schemas.microsoft.com/office/word/2010/wordprocessingInk" xmlns:wne="http://schemas.microsoft.com/office/word/2006/wordml" xmlns:wps="http://schemas.microsoft.com/office/word/2010/wordprocessingShape" mc:Ignorable="w14 w15 wp14">
   <w:tbl>
     <w:tblPr>
-      <w:tblW w:w="9900" w:type="dxa"/>
+      <w:tblW w:w="10226" w:type="dxa"/>
       <w:tblInd w:w="-162" w:type="dxa"/>
       <w:tblBorders>
         <w:top w:val="single" w:sz="4" w:space="0" w:color="auto"/>
@@ -605,18 +589,17 @@
       <w:tblLook w:val="04A0" w:firstRow="1" w:lastRow="0" w:firstColumn="1" w:lastColumn="0" w:noHBand="0" w:noVBand="1"/>
     </w:tblPr>
     <w:tblGrid>
-      <w:gridCol w:w="1890"/>
-      <w:gridCol w:w="4140"/>
-      <w:gridCol w:w="1530"/>
-      <w:gridCol w:w="2340"/>
+      <w:gridCol w:w="5286"/>
+      <w:gridCol w:w="1953"/>
+      <w:gridCol w:w="2987"/>
     </w:tblGrid>
     <w:tr>
       <w:trPr>
-        <w:trHeight w:val="239"/>
+        <w:trHeight w:val="231"/>
       </w:trPr>
       <w:tc>
         <w:tcPr>
-          <w:tcW w:w="1890" w:type="dxa"/>
+          <w:tcW w:w="5286" w:type="dxa"/>
           <w:vMerge w:val="restart"/>
           <w:vAlign w:val="center"/>
         </w:tcPr>
@@ -630,57 +613,20 @@
             <w:rPr>
               <w:rFonts w:ascii="Cambria" w:hAnsi="Cambria" w:cs="Lucida Console"/>
               <w:b/>
-              <w:sz w:val="32"/>
-              <w:szCs w:val="32"/>
-            </w:rPr>
-          </w:pPr>
-          <w:r>
-            <w:rPr>
-              <w:noProof/>
-              <w:lang w:val="en-IN" w:eastAsia="en-IN"/>
-            </w:rPr>
-            <w:drawing>
-              <wp:inline distT="0" distB="0" distL="0" distR="0" wp14:anchorId="6C52BC08" wp14:editId="3D047A2A">
-                <wp:extent cx="1109472" cy="1021080"/>
-                <wp:effectExtent l="0" t="0" r="0" b="0"/>
-                <wp:docPr id="1" name="Picture 1"/>
-                <wp:cNvGraphicFramePr/>
-                <a:graphic xmlns:a="http://schemas.openxmlformats.org/drawingml/2006/main">
-                  <a:graphicData uri="http://schemas.openxmlformats.org/drawingml/2006/picture">
-                    <pic:pic xmlns:pic="http://schemas.openxmlformats.org/drawingml/2006/picture">
-                      <pic:nvPicPr>
-                        <pic:cNvPr id="17020" name="Picture 17020"/>
-                        <pic:cNvPicPr/>
-                      </pic:nvPicPr>
-                      <pic:blipFill>
-                        <a:blip r:embed="rId1"/>
-                        <a:stretch>
-                          <a:fillRect/>
-                        </a:stretch>
-                      </pic:blipFill>
-                      <pic:spPr>
-                        <a:xfrm>
-                          <a:off x="0" y="0"/>
-                          <a:ext cx="1109472" cy="1021080"/>
-                        </a:xfrm>
-                        <a:prstGeom prst="rect">
-                          <a:avLst/>
-                        </a:prstGeom>
-                      </pic:spPr>
-                    </pic:pic>
-                  </a:graphicData>
-                </a:graphic>
-              </wp:inline>
-            </w:drawing>
-          </w:r>
-        </w:p>
-      </w:tc>
-      <w:tc>
-        <w:tcPr>
-          <w:tcW w:w="4140" w:type="dxa"/>
-          <w:vMerge w:val="restart"/>
-          <w:vAlign w:val="center"/>
-        </w:tcPr>
+              <w:sz w:val="30"/>
+              <w:szCs w:val="30"/>
+            </w:rPr>
+          </w:pPr>
+          <w:r>
+            <w:rPr>
+              <w:rFonts w:ascii="Cambria" w:hAnsi="Cambria" w:cs="Lucida Console"/>
+              <w:b/>
+              <w:sz w:val="30"/>
+              <w:szCs w:val="30"/>
+            </w:rPr>
+            <w:t>SURENDRA LABORATORIES</w:t>
+          </w:r>
+        </w:p>
         <w:p>
           <w:pPr>
             <w:autoSpaceDE w:val="0"/>
@@ -702,9 +648,65 @@
               <w:sz w:val="30"/>
               <w:szCs w:val="30"/>
             </w:rPr>
-            <w:t>SURENDRA LABORATORIES</w:t>
-          </w:r>
-        </w:p>
+            <w:t xml:space="preserve"> SERVICES LLP</w:t>
+          </w:r>
+        </w:p>
+      </w:tc>
+      <w:tc>
+        <w:tcPr>
+          <w:tcW w:w="1953" w:type="dxa"/>
+        </w:tcPr>
+        <w:p>
+          <w:pPr>
+            <w:autoSpaceDE w:val="0"/>
+            <w:autoSpaceDN w:val="0"/>
+            <w:adjustRightInd w:val="0"/>
+            <w:spacing w:after="0" w:line="240" w:lineRule="auto"/>
+            <w:rPr>
+              <w:rFonts w:ascii="Cambria" w:hAnsi="Cambria" w:cs="Lucida Console"/>
+            </w:rPr>
+          </w:pPr>
+          <w:r>
+            <w:rPr>
+              <w:rFonts w:ascii="Cambria" w:hAnsi="Cambria" w:cs="Lucida Console"/>
+            </w:rPr>
+            <w:t>Section -</w:t>
+          </w:r>
+        </w:p>
+      </w:tc>
+      <w:tc>
+        <w:tcPr>
+          <w:tcW w:w="2987" w:type="dxa"/>
+        </w:tcPr>
+        <w:p>
+          <w:pPr>
+            <w:autoSpaceDE w:val="0"/>
+            <w:autoSpaceDN w:val="0"/>
+            <w:adjustRightInd w:val="0"/>
+            <w:spacing w:after="0" w:line="240" w:lineRule="auto"/>
+            <w:rPr>
+              <w:rFonts w:ascii="Cambria" w:hAnsi="Cambria" w:cs="Lucida Console"/>
+            </w:rPr>
+          </w:pPr>
+          <w:r>
+            <w:rPr>
+              <w:rFonts w:ascii="Cambria" w:hAnsi="Cambria" w:cs="Lucida Console"/>
+            </w:rPr>
+            <w:t>Instrument Section 1</w:t>
+          </w:r>
+        </w:p>
+      </w:tc>
+    </w:tr>
+    <w:tr>
+      <w:trPr>
+        <w:trHeight w:val="122"/>
+      </w:trPr>
+      <w:tc>
+        <w:tcPr>
+          <w:tcW w:w="5286" w:type="dxa"/>
+          <w:vMerge/>
+          <w:vAlign w:val="center"/>
+        </w:tcPr>
         <w:p>
           <w:pPr>
             <w:autoSpaceDE w:val="0"/>
@@ -715,24 +717,15 @@
             <w:rPr>
               <w:rFonts w:ascii="Cambria" w:hAnsi="Cambria" w:cs="Lucida Console"/>
               <w:b/>
-              <w:sz w:val="30"/>
-              <w:szCs w:val="30"/>
-            </w:rPr>
-          </w:pPr>
-          <w:r>
-            <w:rPr>
-              <w:rFonts w:ascii="Cambria" w:hAnsi="Cambria" w:cs="Lucida Console"/>
-              <w:b/>
-              <w:sz w:val="30"/>
-              <w:szCs w:val="30"/>
-            </w:rPr>
-            <w:t xml:space="preserve"> SERVICES LLP</w:t>
-          </w:r>
+              <w:sz w:val="32"/>
+              <w:szCs w:val="32"/>
+            </w:rPr>
+          </w:pPr>
         </w:p>
       </w:tc>
       <w:tc>
         <w:tcPr>
-          <w:tcW w:w="1530" w:type="dxa"/>
+          <w:tcW w:w="1953" w:type="dxa"/>
         </w:tcPr>
         <w:p>
           <w:pPr>
@@ -748,14 +741,9 @@
             <w:rPr>
               <w:rFonts w:ascii="Cambria" w:hAnsi="Cambria" w:cs="Lucida Console"/>
             </w:rPr>
-            <w:t>Section -</w:t>
-          </w:r>
-        </w:p>
-      </w:tc>
-      <w:tc>
-        <w:tcPr>
-          <w:tcW w:w="2340" w:type="dxa"/>
-        </w:tcPr>
+            <w:t xml:space="preserve">Issue No.           </w:t>
+          </w:r>
+        </w:p>
         <w:p>
           <w:pPr>
             <w:autoSpaceDE w:val="0"/>
@@ -770,20 +758,58 @@
             <w:rPr>
               <w:rFonts w:ascii="Cambria" w:hAnsi="Cambria" w:cs="Lucida Console"/>
             </w:rPr>
-            <w:t>Instrument Section 1</w:t>
+            <w:t xml:space="preserve">Issue Date       </w:t>
+          </w:r>
+        </w:p>
+      </w:tc>
+      <w:tc>
+        <w:tcPr>
+          <w:tcW w:w="2987" w:type="dxa"/>
+        </w:tcPr>
+        <w:p>
+          <w:pPr>
+            <w:autoSpaceDE w:val="0"/>
+            <w:autoSpaceDN w:val="0"/>
+            <w:adjustRightInd w:val="0"/>
+            <w:spacing w:after="0" w:line="240" w:lineRule="auto"/>
+            <w:rPr>
+              <w:rFonts w:ascii="Cambria" w:hAnsi="Cambria" w:cs="Lucida Console"/>
+            </w:rPr>
+          </w:pPr>
+          <w:r>
+            <w:rPr>
+              <w:rFonts w:ascii="Cambria" w:hAnsi="Cambria" w:cs="Lucida Console"/>
+            </w:rPr>
+            <w:t>02</w:t>
+          </w:r>
+        </w:p>
+        <w:p>
+          <w:pPr>
+            <w:autoSpaceDE w:val="0"/>
+            <w:autoSpaceDN w:val="0"/>
+            <w:adjustRightInd w:val="0"/>
+            <w:spacing w:after="0" w:line="240" w:lineRule="auto"/>
+            <w:rPr>
+              <w:rFonts w:ascii="Cambria" w:hAnsi="Cambria" w:cs="Lucida Console"/>
+            </w:rPr>
+          </w:pPr>
+          <w:r>
+            <w:rPr>
+              <w:rFonts w:ascii="Cambria" w:hAnsi="Cambria" w:cs="Lucida Console"/>
+            </w:rPr>
+            <w:t>13-05-2025</w:t>
           </w:r>
         </w:p>
       </w:tc>
     </w:tr>
     <w:tr>
       <w:trPr>
-        <w:trHeight w:val="126"/>
+        <w:trHeight w:val="122"/>
       </w:trPr>
       <w:tc>
         <w:tcPr>
-          <w:tcW w:w="1890" w:type="dxa"/>
+          <w:tcW w:w="5286" w:type="dxa"/>
           <w:vMerge/>
-          <w:vAlign w:val="center"/>
         </w:tcPr>
         <w:p>
           <w:pPr>
@@ -803,9 +829,102 @@
       </w:tc>
       <w:tc>
         <w:tcPr>
-          <w:tcW w:w="4140" w:type="dxa"/>
-          <w:vMerge/>
-          <w:vAlign w:val="center"/>
+          <w:tcW w:w="1953" w:type="dxa"/>
+        </w:tcPr>
+        <w:p>
+          <w:pPr>
+            <w:autoSpaceDE w:val="0"/>
+            <w:autoSpaceDN w:val="0"/>
+            <w:adjustRightInd w:val="0"/>
+            <w:spacing w:after="0" w:line="240" w:lineRule="auto"/>
+            <w:rPr>
+              <w:rFonts w:ascii="Cambria" w:hAnsi="Cambria" w:cs="Lucida Console"/>
+            </w:rPr>
+          </w:pPr>
+          <w:r>
+            <w:rPr>
+              <w:rFonts w:ascii="Cambria" w:hAnsi="Cambria" w:cs="Lucida Console"/>
+            </w:rPr>
+            <w:t>Amend.</w:t>
+          </w:r>
+          <w:r>
+            <w:rPr>
+              <w:rFonts w:ascii="Cambria" w:hAnsi="Cambria" w:cs="Lucida Console"/>
+            </w:rPr>
+            <w:t xml:space="preserve"> No.    </w:t>
+          </w:r>
+        </w:p>
+        <w:p>
+          <w:pPr>
+            <w:autoSpaceDE w:val="0"/>
+            <w:autoSpaceDN w:val="0"/>
+            <w:adjustRightInd w:val="0"/>
+            <w:spacing w:after="0" w:line="240" w:lineRule="auto"/>
+            <w:rPr>
+              <w:rFonts w:ascii="Cambria" w:hAnsi="Cambria" w:cs="Lucida Console"/>
+            </w:rPr>
+          </w:pPr>
+          <w:r>
+            <w:rPr>
+              <w:rFonts w:ascii="Cambria" w:hAnsi="Cambria" w:cs="Lucida Console"/>
+            </w:rPr>
+            <w:t>Amend.</w:t>
+          </w:r>
+          <w:r>
+            <w:rPr>
+              <w:rFonts w:ascii="Cambria" w:hAnsi="Cambria" w:cs="Lucida Console"/>
+            </w:rPr>
+            <w:t xml:space="preserve"> Date</w:t>
+          </w:r>
+        </w:p>
+      </w:tc>
+      <w:tc>
+        <w:tcPr>
+          <w:tcW w:w="2987" w:type="dxa"/>
+        </w:tcPr>
+        <w:p>
+          <w:pPr>
+            <w:autoSpaceDE w:val="0"/>
+            <w:autoSpaceDN w:val="0"/>
+            <w:adjustRightInd w:val="0"/>
+            <w:spacing w:after="0" w:line="240" w:lineRule="auto"/>
+            <w:rPr>
+              <w:rFonts w:ascii="Cambria" w:hAnsi="Cambria" w:cs="Lucida Console"/>
+            </w:rPr>
+          </w:pPr>
+          <w:r>
+            <w:rPr>
+              <w:rFonts w:ascii="Cambria" w:hAnsi="Cambria" w:cs="Lucida Console"/>
+            </w:rPr>
+            <w:t>00</w:t>
+          </w:r>
+        </w:p>
+        <w:p>
+          <w:pPr>
+            <w:autoSpaceDE w:val="0"/>
+            <w:autoSpaceDN w:val="0"/>
+            <w:adjustRightInd w:val="0"/>
+            <w:spacing w:after="0" w:line="240" w:lineRule="auto"/>
+            <w:rPr>
+              <w:rFonts w:ascii="Cambria" w:hAnsi="Cambria" w:cs="Lucida Console"/>
+            </w:rPr>
+          </w:pPr>
+          <w:r>
+            <w:rPr>
+              <w:rFonts w:ascii="Cambria" w:hAnsi="Cambria" w:cs="Lucida Console"/>
+            </w:rPr>
+            <w:t>06-05-2025</w:t>
+          </w:r>
+        </w:p>
+      </w:tc>
+    </w:tr>
+    <w:tr>
+      <w:trPr>
+        <w:trHeight w:val="122"/>
+      </w:trPr>
+      <w:tc>
+        <w:tcPr>
+          <w:tcW w:w="5286" w:type="dxa"/>
         </w:tcPr>
         <w:p>
           <w:pPr>
@@ -817,15 +936,24 @@
             <w:rPr>
               <w:rFonts w:ascii="Cambria" w:hAnsi="Cambria" w:cs="Lucida Console"/>
               <w:b/>
-              <w:sz w:val="32"/>
-              <w:szCs w:val="32"/>
-            </w:rPr>
-          </w:pPr>
+              <w:sz w:val="28"/>
+              <w:szCs w:val="28"/>
+            </w:rPr>
+          </w:pPr>
+          <w:r>
+            <w:rPr>
+              <w:rFonts w:ascii="Cambria" w:hAnsi="Cambria" w:cs="Lucida Console"/>
+              <w:b/>
+              <w:sz w:val="28"/>
+              <w:szCs w:val="28"/>
+            </w:rPr>
+            <w:t>TEST PROTOCOLS</w:t>
+          </w:r>
         </w:p>
       </w:tc>
       <w:tc>
         <w:tcPr>
-          <w:tcW w:w="1530" w:type="dxa"/>
+          <w:tcW w:w="1953" w:type="dxa"/>
         </w:tcPr>
         <w:p>
           <w:pPr>
@@ -841,9 +969,26 @@
             <w:rPr>
               <w:rFonts w:ascii="Cambria" w:hAnsi="Cambria" w:cs="Lucida Console"/>
             </w:rPr>
-            <w:t xml:space="preserve">Issue No.           </w:t>
-          </w:r>
-        </w:p>
+            <w:t>Page</w:t>
+          </w:r>
+          <w:r>
+            <w:rPr>
+              <w:rFonts w:ascii="Cambria" w:hAnsi="Cambria" w:cs="Lucida Console"/>
+            </w:rPr>
+            <w:t>s</w:t>
+          </w:r>
+          <w:r>
+            <w:rPr>
+              <w:rFonts w:ascii="Cambria" w:hAnsi="Cambria" w:cs="Lucida Console"/>
+            </w:rPr>
+            <w:t xml:space="preserve">                   </w:t>
+          </w:r>
+        </w:p>
+      </w:tc>
+      <w:tc>
+        <w:tcPr>
+          <w:tcW w:w="2987" w:type="dxa"/>
+        </w:tcPr>
         <w:p>
           <w:pPr>
             <w:autoSpaceDE w:val="0"/>
@@ -858,58 +1003,18 @@
             <w:rPr>
               <w:rFonts w:ascii="Cambria" w:hAnsi="Cambria" w:cs="Lucida Console"/>
             </w:rPr>
-            <w:t xml:space="preserve">Issue Date       </w:t>
-          </w:r>
-        </w:p>
-      </w:tc>
-      <w:tc>
-        <w:tcPr>
-          <w:tcW w:w="2340" w:type="dxa"/>
-        </w:tcPr>
-        <w:p>
-          <w:pPr>
-            <w:autoSpaceDE w:val="0"/>
-            <w:autoSpaceDN w:val="0"/>
-            <w:adjustRightInd w:val="0"/>
-            <w:spacing w:after="0" w:line="240" w:lineRule="auto"/>
-            <w:rPr>
-              <w:rFonts w:ascii="Cambria" w:hAnsi="Cambria" w:cs="Lucida Console"/>
-            </w:rPr>
-          </w:pPr>
-          <w:r>
-            <w:rPr>
-              <w:rFonts w:ascii="Cambria" w:hAnsi="Cambria" w:cs="Lucida Console"/>
-            </w:rPr>
-            <w:t>02</w:t>
-          </w:r>
-        </w:p>
-        <w:p>
-          <w:pPr>
-            <w:autoSpaceDE w:val="0"/>
-            <w:autoSpaceDN w:val="0"/>
-            <w:adjustRightInd w:val="0"/>
-            <w:spacing w:after="0" w:line="240" w:lineRule="auto"/>
-            <w:rPr>
-              <w:rFonts w:ascii="Cambria" w:hAnsi="Cambria" w:cs="Lucida Console"/>
-            </w:rPr>
-          </w:pPr>
-          <w:r>
-            <w:rPr>
-              <w:rFonts w:ascii="Cambria" w:hAnsi="Cambria" w:cs="Lucida Console"/>
-            </w:rPr>
-            <w:t>13-05-2025</w:t>
+            <w:t>1</w:t>
           </w:r>
         </w:p>
       </w:tc>
     </w:tr>
     <w:tr>
       <w:trPr>
-        <w:trHeight w:val="126"/>
+        <w:trHeight w:val="122"/>
       </w:trPr>
       <w:tc>
         <w:tcPr>
-          <w:tcW w:w="1890" w:type="dxa"/>
-          <w:vMerge/>
+          <w:tcW w:w="5286" w:type="dxa"/>
         </w:tcPr>
         <w:p>
           <w:pPr>
@@ -921,16 +1026,26 @@
             <w:rPr>
               <w:rFonts w:ascii="Cambria" w:hAnsi="Cambria" w:cs="Lucida Console"/>
               <w:b/>
-              <w:sz w:val="32"/>
-              <w:szCs w:val="32"/>
-            </w:rPr>
-          </w:pPr>
+              <w:sz w:val="24"/>
+              <w:szCs w:val="24"/>
+            </w:rPr>
+          </w:pPr>
+          <w:r>
+            <w:rPr>
+              <w:rFonts w:ascii="Cambria" w:hAnsi="Cambria" w:cs="Lucida Console"/>
+              <w:b/>
+              <w:sz w:val="24"/>
+              <w:szCs w:val="24"/>
+            </w:rPr>
+            <w:t xml:space="preserve">Protocol </w:t>
+          </w:r>
+          <w:bookmarkStart w:id="0" w:name="_GoBack"/>
+          <w:bookmarkEnd w:id="0"/>
         </w:p>
       </w:tc>
       <w:tc>
         <w:tcPr>
-          <w:tcW w:w="4140" w:type="dxa"/>
-          <w:vMerge/>
+          <w:tcW w:w="1953" w:type="dxa"/>
         </w:tcPr>
         <w:p>
           <w:pPr>
@@ -938,297 +1053,21 @@
             <w:autoSpaceDN w:val="0"/>
             <w:adjustRightInd w:val="0"/>
             <w:spacing w:after="0" w:line="240" w:lineRule="auto"/>
-            <w:jc w:val="center"/>
-            <w:rPr>
-              <w:rFonts w:ascii="Cambria" w:hAnsi="Cambria" w:cs="Lucida Console"/>
-              <w:b/>
-              <w:sz w:val="32"/>
-              <w:szCs w:val="32"/>
-            </w:rPr>
-          </w:pPr>
+            <w:rPr>
+              <w:rFonts w:ascii="Cambria" w:hAnsi="Cambria" w:cs="Lucida Console"/>
+            </w:rPr>
+          </w:pPr>
+          <w:r>
+            <w:rPr>
+              <w:rFonts w:ascii="Cambria" w:hAnsi="Cambria" w:cs="Lucida Console"/>
+            </w:rPr>
+            <w:t>Document No</w:t>
+          </w:r>
         </w:p>
       </w:tc>
       <w:tc>
         <w:tcPr>
-          <w:tcW w:w="1530" w:type="dxa"/>
-        </w:tcPr>
-        <w:p>
-          <w:pPr>
-            <w:autoSpaceDE w:val="0"/>
-            <w:autoSpaceDN w:val="0"/>
-            <w:adjustRightInd w:val="0"/>
-            <w:spacing w:after="0" w:line="240" w:lineRule="auto"/>
-            <w:rPr>
-              <w:rFonts w:ascii="Cambria" w:hAnsi="Cambria" w:cs="Lucida Console"/>
-            </w:rPr>
-          </w:pPr>
-          <w:r>
-            <w:rPr>
-              <w:rFonts w:ascii="Cambria" w:hAnsi="Cambria" w:cs="Lucida Console"/>
-            </w:rPr>
-            <w:t>Amend.</w:t>
-          </w:r>
-          <w:r>
-            <w:rPr>
-              <w:rFonts w:ascii="Cambria" w:hAnsi="Cambria" w:cs="Lucida Console"/>
-            </w:rPr>
-            <w:t xml:space="preserve"> No.    </w:t>
-          </w:r>
-        </w:p>
-        <w:p>
-          <w:pPr>
-            <w:autoSpaceDE w:val="0"/>
-            <w:autoSpaceDN w:val="0"/>
-            <w:adjustRightInd w:val="0"/>
-            <w:spacing w:after="0" w:line="240" w:lineRule="auto"/>
-            <w:rPr>
-              <w:rFonts w:ascii="Cambria" w:hAnsi="Cambria" w:cs="Lucida Console"/>
-            </w:rPr>
-          </w:pPr>
-          <w:r>
-            <w:rPr>
-              <w:rFonts w:ascii="Cambria" w:hAnsi="Cambria" w:cs="Lucida Console"/>
-            </w:rPr>
-            <w:t>Amend.</w:t>
-          </w:r>
-          <w:r>
-            <w:rPr>
-              <w:rFonts w:ascii="Cambria" w:hAnsi="Cambria" w:cs="Lucida Console"/>
-            </w:rPr>
-            <w:t xml:space="preserve"> Date</w:t>
-          </w:r>
-        </w:p>
-      </w:tc>
-      <w:tc>
-        <w:tcPr>
-          <w:tcW w:w="2340" w:type="dxa"/>
-        </w:tcPr>
-        <w:p>
-          <w:pPr>
-            <w:autoSpaceDE w:val="0"/>
-            <w:autoSpaceDN w:val="0"/>
-            <w:adjustRightInd w:val="0"/>
-            <w:spacing w:after="0" w:line="240" w:lineRule="auto"/>
-            <w:rPr>
-              <w:rFonts w:ascii="Cambria" w:hAnsi="Cambria" w:cs="Lucida Console"/>
-            </w:rPr>
-          </w:pPr>
-          <w:r>
-            <w:rPr>
-              <w:rFonts w:ascii="Cambria" w:hAnsi="Cambria" w:cs="Lucida Console"/>
-            </w:rPr>
-            <w:t>00</w:t>
-          </w:r>
-        </w:p>
-        <w:p>
-          <w:pPr>
-            <w:autoSpaceDE w:val="0"/>
-            <w:autoSpaceDN w:val="0"/>
-            <w:adjustRightInd w:val="0"/>
-            <w:spacing w:after="0" w:line="240" w:lineRule="auto"/>
-            <w:rPr>
-              <w:rFonts w:ascii="Cambria" w:hAnsi="Cambria" w:cs="Lucida Console"/>
-            </w:rPr>
-          </w:pPr>
-          <w:r>
-            <w:rPr>
-              <w:rFonts w:ascii="Cambria" w:hAnsi="Cambria" w:cs="Lucida Console"/>
-            </w:rPr>
-            <w:t>06-05-2025</w:t>
-          </w:r>
-        </w:p>
-      </w:tc>
-    </w:tr>
-    <w:tr>
-      <w:trPr>
-        <w:trHeight w:val="126"/>
-      </w:trPr>
-      <w:tc>
-        <w:tcPr>
-          <w:tcW w:w="1890" w:type="dxa"/>
-          <w:vMerge/>
-        </w:tcPr>
-        <w:p>
-          <w:pPr>
-            <w:autoSpaceDE w:val="0"/>
-            <w:autoSpaceDN w:val="0"/>
-            <w:adjustRightInd w:val="0"/>
-            <w:spacing w:after="0" w:line="240" w:lineRule="auto"/>
-            <w:jc w:val="center"/>
-            <w:rPr>
-              <w:rFonts w:ascii="Cambria" w:hAnsi="Cambria" w:cs="Lucida Console"/>
-              <w:b/>
-              <w:sz w:val="32"/>
-              <w:szCs w:val="32"/>
-            </w:rPr>
-          </w:pPr>
-        </w:p>
-      </w:tc>
-      <w:tc>
-        <w:tcPr>
-          <w:tcW w:w="4140" w:type="dxa"/>
-        </w:tcPr>
-        <w:p>
-          <w:pPr>
-            <w:autoSpaceDE w:val="0"/>
-            <w:autoSpaceDN w:val="0"/>
-            <w:adjustRightInd w:val="0"/>
-            <w:spacing w:after="0" w:line="240" w:lineRule="auto"/>
-            <w:jc w:val="center"/>
-            <w:rPr>
-              <w:rFonts w:ascii="Cambria" w:hAnsi="Cambria" w:cs="Lucida Console"/>
-              <w:b/>
-              <w:sz w:val="28"/>
-              <w:szCs w:val="28"/>
-            </w:rPr>
-          </w:pPr>
-          <w:r>
-            <w:rPr>
-              <w:rFonts w:ascii="Cambria" w:hAnsi="Cambria" w:cs="Lucida Console"/>
-              <w:b/>
-              <w:sz w:val="28"/>
-              <w:szCs w:val="28"/>
-            </w:rPr>
-            <w:t>TEST PROTOCOLS</w:t>
-          </w:r>
-        </w:p>
-      </w:tc>
-      <w:tc>
-        <w:tcPr>
-          <w:tcW w:w="1530" w:type="dxa"/>
-        </w:tcPr>
-        <w:p>
-          <w:pPr>
-            <w:autoSpaceDE w:val="0"/>
-            <w:autoSpaceDN w:val="0"/>
-            <w:adjustRightInd w:val="0"/>
-            <w:spacing w:after="0" w:line="240" w:lineRule="auto"/>
-            <w:rPr>
-              <w:rFonts w:ascii="Cambria" w:hAnsi="Cambria" w:cs="Lucida Console"/>
-            </w:rPr>
-          </w:pPr>
-          <w:r>
-            <w:rPr>
-              <w:rFonts w:ascii="Cambria" w:hAnsi="Cambria" w:cs="Lucida Console"/>
-            </w:rPr>
-            <w:t>Page</w:t>
-          </w:r>
-          <w:r>
-            <w:rPr>
-              <w:rFonts w:ascii="Cambria" w:hAnsi="Cambria" w:cs="Lucida Console"/>
-            </w:rPr>
-            <w:t>s</w:t>
-          </w:r>
-          <w:r>
-            <w:rPr>
-              <w:rFonts w:ascii="Cambria" w:hAnsi="Cambria" w:cs="Lucida Console"/>
-            </w:rPr>
-            <w:t xml:space="preserve">                   </w:t>
-          </w:r>
-        </w:p>
-      </w:tc>
-      <w:tc>
-        <w:tcPr>
-          <w:tcW w:w="2340" w:type="dxa"/>
-        </w:tcPr>
-        <w:p>
-          <w:pPr>
-            <w:autoSpaceDE w:val="0"/>
-            <w:autoSpaceDN w:val="0"/>
-            <w:adjustRightInd w:val="0"/>
-            <w:spacing w:after="0" w:line="240" w:lineRule="auto"/>
-            <w:rPr>
-              <w:rFonts w:ascii="Cambria" w:hAnsi="Cambria" w:cs="Lucida Console"/>
-            </w:rPr>
-          </w:pPr>
-          <w:r>
-            <w:rPr>
-              <w:rFonts w:ascii="Cambria" w:hAnsi="Cambria" w:cs="Lucida Console"/>
-            </w:rPr>
-            <w:t>1</w:t>
-          </w:r>
-        </w:p>
-      </w:tc>
-    </w:tr>
-    <w:tr>
-      <w:trPr>
-        <w:trHeight w:val="126"/>
-      </w:trPr>
-      <w:tc>
-        <w:tcPr>
-          <w:tcW w:w="1890" w:type="dxa"/>
-          <w:vMerge/>
-        </w:tcPr>
-        <w:p>
-          <w:pPr>
-            <w:autoSpaceDE w:val="0"/>
-            <w:autoSpaceDN w:val="0"/>
-            <w:adjustRightInd w:val="0"/>
-            <w:spacing w:after="0" w:line="240" w:lineRule="auto"/>
-            <w:jc w:val="center"/>
-            <w:rPr>
-              <w:rFonts w:ascii="Cambria" w:hAnsi="Cambria" w:cs="Lucida Console"/>
-              <w:b/>
-              <w:sz w:val="32"/>
-              <w:szCs w:val="32"/>
-            </w:rPr>
-          </w:pPr>
-        </w:p>
-      </w:tc>
-      <w:tc>
-        <w:tcPr>
-          <w:tcW w:w="4140" w:type="dxa"/>
-        </w:tcPr>
-        <w:p>
-          <w:pPr>
-            <w:autoSpaceDE w:val="0"/>
-            <w:autoSpaceDN w:val="0"/>
-            <w:adjustRightInd w:val="0"/>
-            <w:spacing w:after="0" w:line="240" w:lineRule="auto"/>
-            <w:jc w:val="center"/>
-            <w:rPr>
-              <w:rFonts w:ascii="Cambria" w:hAnsi="Cambria" w:cs="Lucida Console"/>
-              <w:b/>
-              <w:sz w:val="24"/>
-              <w:szCs w:val="24"/>
-            </w:rPr>
-          </w:pPr>
-          <w:r>
-            <w:rPr>
-              <w:rFonts w:ascii="Cambria" w:hAnsi="Cambria" w:cs="Lucida Console"/>
-              <w:b/>
-              <w:sz w:val="24"/>
-              <w:szCs w:val="24"/>
-            </w:rPr>
-            <w:t xml:space="preserve">Protocol </w:t>
-          </w:r>
-        </w:p>
-      </w:tc>
-      <w:tc>
-        <w:tcPr>
-          <w:tcW w:w="1530" w:type="dxa"/>
-        </w:tcPr>
-        <w:p>
-          <w:pPr>
-            <w:autoSpaceDE w:val="0"/>
-            <w:autoSpaceDN w:val="0"/>
-            <w:adjustRightInd w:val="0"/>
-            <w:spacing w:after="0" w:line="240" w:lineRule="auto"/>
-            <w:rPr>
-              <w:rFonts w:ascii="Cambria" w:hAnsi="Cambria" w:cs="Lucida Console"/>
-            </w:rPr>
-          </w:pPr>
-          <w:r>
-            <w:rPr>
-              <w:rFonts w:ascii="Cambria" w:hAnsi="Cambria" w:cs="Lucida Console"/>
-            </w:rPr>
-            <w:t>Document No</w:t>
-          </w:r>
-        </w:p>
-      </w:tc>
-      <w:tc>
-        <w:tcPr>
-          <w:tcW w:w="2340" w:type="dxa"/>
+          <w:tcW w:w="2987" w:type="dxa"/>
         </w:tcPr>
         <w:p>
           <w:pPr>
@@ -1259,7 +1098,7 @@
 </file>
 
 <file path=word/header3.xml><?xml version="1.0" encoding="utf-8"?>
-<w:hdr xmlns:wpc="http://schemas.microsoft.com/office/word/2010/wordprocessingCanvas" xmlns:cx="http://schemas.microsoft.com/office/drawing/2014/chartex" xmlns:cx1="http://schemas.microsoft.com/office/drawing/2015/9/8/chartex" xmlns:cx2="http://schemas.microsoft.com/office/drawing/2015/10/21/chartex" xmlns:cx3="http://schemas.microsoft.com/office/drawing/2016/5/9/chartex" xmlns:cx4="http://schemas.microsoft.com/office/drawing/2016/5/10/chartex" xmlns:cx5="http://schemas.microsoft.com/office/drawing/2016/5/11/chartex" xmlns:cx6="http://schemas.microsoft.com/office/drawing/2016/5/12/chartex" xmlns:cx7="http://schemas.microsoft.com/office/drawing/2016/5/13/chartex" xmlns:cx8="http://schemas.microsoft.com/office/drawing/2016/5/14/chartex" xmlns:mc="http://schemas.openxmlformats.org/markup-compatibility/2006" xmlns:aink="http://schemas.microsoft.com/office/drawing/2016/ink" xmlns:am3d="http://schemas.microsoft.com/office/drawing/2017/model3d" xmlns:o="urn:schemas-microsoft-com:office:office" xmlns:oel="http://schemas.microsoft.com/office/2019/extlst" xmlns:r="http://schemas.openxmlformats.org/officeDocument/2006/relationships" xmlns:m="http://schemas.openxmlformats.org/officeDocument/2006/math" xmlns:v="urn:schemas-microsoft-com:vml" xmlns:wp14="http://schemas.microsoft.com/office/word/2010/wordprocessingDrawing" xmlns:wp="http://schemas.openxmlformats.org/drawingml/2006/wordprocessingDrawing" xmlns:w10="urn:schemas-microsoft-com:office:word" xmlns:w="http://schemas.openxmlformats.org/wordprocessingml/2006/main" xmlns:w14="http://schemas.microsoft.com/office/word/2010/wordml" xmlns:w15="http://schemas.microsoft.com/office/word/2012/wordml" xmlns:w16cex="http://schemas.microsoft.com/office/word/2018/wordml/cex" xmlns:w16cid="http://schemas.microsoft.com/office/word/2016/wordml/cid" xmlns:w16="http://schemas.microsoft.com/office/word/2018/wordml" xmlns:w16du="http://schemas.microsoft.com/office/word/2023/wordml/word16du" xmlns:w16sdtdh="http://schemas.microsoft.com/office/word/2020/wordml/sdtdatahash" xmlns:w16sdtfl="http://schemas.microsoft.com/office/word/2024/wordml/sdtformatlock" xmlns:w16se="http://schemas.microsoft.com/office/word/2015/wordml/symex" xmlns:wpg="http://schemas.microsoft.com/office/word/2010/wordprocessingGroup" xmlns:wpi="http://schemas.microsoft.com/office/word/2010/wordprocessingInk" xmlns:wne="http://schemas.microsoft.com/office/word/2006/wordml" xmlns:wps="http://schemas.microsoft.com/office/word/2010/wordprocessingShape" mc:Ignorable="w14 w15 w16se w16cid w16 w16cex w16sdtdh w16sdtfl w16du wp14">
+<w:hdr xmlns:wpc="http://schemas.microsoft.com/office/word/2010/wordprocessingCanvas" xmlns:mc="http://schemas.openxmlformats.org/markup-compatibility/2006" xmlns:o="urn:schemas-microsoft-com:office:office" xmlns:r="http://schemas.openxmlformats.org/officeDocument/2006/relationships" xmlns:m="http://schemas.openxmlformats.org/officeDocument/2006/math" xmlns:v="urn:schemas-microsoft-com:vml" xmlns:wp14="http://schemas.microsoft.com/office/word/2010/wordprocessingDrawing" xmlns:wp="http://schemas.openxmlformats.org/drawingml/2006/wordprocessingDrawing" xmlns:w10="urn:schemas-microsoft-com:office:word" xmlns:w="http://schemas.openxmlformats.org/wordprocessingml/2006/main" xmlns:w14="http://schemas.microsoft.com/office/word/2010/wordml" xmlns:w15="http://schemas.microsoft.com/office/word/2012/wordml" xmlns:wpg="http://schemas.microsoft.com/office/word/2010/wordprocessingGroup" xmlns:wpi="http://schemas.microsoft.com/office/word/2010/wordprocessingInk" xmlns:wne="http://schemas.microsoft.com/office/word/2006/wordml" xmlns:wps="http://schemas.microsoft.com/office/word/2010/wordprocessingShape" mc:Ignorable="w14 w15 wp14">
   <w:p>
     <w:pPr>
       <w:pStyle w:val="Header"/>
@@ -1269,8 +1108,8 @@
 </file>
 
 <file path=word/numbering.xml><?xml version="1.0" encoding="utf-8"?>
-<w:numbering xmlns:wpc="http://schemas.microsoft.com/office/word/2010/wordprocessingCanvas" xmlns:cx="http://schemas.microsoft.com/office/drawing/2014/chartex" xmlns:cx1="http://schemas.microsoft.com/office/drawing/2015/9/8/chartex" xmlns:cx2="http://schemas.microsoft.com/office/drawing/2015/10/21/chartex" xmlns:cx3="http://schemas.microsoft.com/office/drawing/2016/5/9/chartex" xmlns:cx4="http://schemas.microsoft.com/office/drawing/2016/5/10/chartex" xmlns:cx5="http://schemas.microsoft.com/office/drawing/2016/5/11/chartex" xmlns:cx6="http://schemas.microsoft.com/office/drawing/2016/5/12/chartex" xmlns:cx7="http://schemas.microsoft.com/office/drawing/2016/5/13/chartex" xmlns:cx8="http://schemas.microsoft.com/office/drawing/2016/5/14/chartex" xmlns:mc="http://schemas.openxmlformats.org/markup-compatibility/2006" xmlns:aink="http://schemas.microsoft.com/office/drawing/2016/ink" xmlns:am3d="http://schemas.microsoft.com/office/drawing/2017/model3d" xmlns:o="urn:schemas-microsoft-com:office:office" xmlns:oel="http://schemas.microsoft.com/office/2019/extlst" xmlns:r="http://schemas.openxmlformats.org/officeDocument/2006/relationships" xmlns:m="http://schemas.openxmlformats.org/officeDocument/2006/math" xmlns:v="urn:schemas-microsoft-com:vml" xmlns:wp14="http://schemas.microsoft.com/office/word/2010/wordprocessingDrawing" xmlns:wp="http://schemas.openxmlformats.org/drawingml/2006/wordprocessingDrawing" xmlns:w10="urn:schemas-microsoft-com:office:word" xmlns:w="http://schemas.openxmlformats.org/wordprocessingml/2006/main" xmlns:w14="http://schemas.microsoft.com/office/word/2010/wordml" xmlns:w15="http://schemas.microsoft.com/office/word/2012/wordml" xmlns:w16cex="http://schemas.microsoft.com/office/word/2018/wordml/cex" xmlns:w16cid="http://schemas.microsoft.com/office/word/2016/wordml/cid" xmlns:w16="http://schemas.microsoft.com/office/word/2018/wordml" xmlns:w16du="http://schemas.microsoft.com/office/word/2023/wordml/word16du" xmlns:w16sdtdh="http://schemas.microsoft.com/office/word/2020/wordml/sdtdatahash" xmlns:w16sdtfl="http://schemas.microsoft.com/office/word/2024/wordml/sdtformatlock" xmlns:w16se="http://schemas.microsoft.com/office/word/2015/wordml/symex" xmlns:wpg="http://schemas.microsoft.com/office/word/2010/wordprocessingGroup" xmlns:wpi="http://schemas.microsoft.com/office/word/2010/wordprocessingInk" xmlns:wne="http://schemas.microsoft.com/office/word/2006/wordml" xmlns:wps="http://schemas.microsoft.com/office/word/2010/wordprocessingShape" mc:Ignorable="w14 w15 w16se w16cid w16 w16cex w16sdtdh w16sdtfl w16du wp14">
-  <w:abstractNum w:abstractNumId="0" w15:restartNumberingAfterBreak="0">
+<w:numbering xmlns:wpc="http://schemas.microsoft.com/office/word/2010/wordprocessingCanvas" xmlns:mc="http://schemas.openxmlformats.org/markup-compatibility/2006" xmlns:o="urn:schemas-microsoft-com:office:office" xmlns:r="http://schemas.openxmlformats.org/officeDocument/2006/relationships" xmlns:m="http://schemas.openxmlformats.org/officeDocument/2006/math" xmlns:v="urn:schemas-microsoft-com:vml" xmlns:wp14="http://schemas.microsoft.com/office/word/2010/wordprocessingDrawing" xmlns:wp="http://schemas.openxmlformats.org/drawingml/2006/wordprocessingDrawing" xmlns:w10="urn:schemas-microsoft-com:office:word" xmlns:w="http://schemas.openxmlformats.org/wordprocessingml/2006/main" xmlns:w14="http://schemas.microsoft.com/office/word/2010/wordml" xmlns:w15="http://schemas.microsoft.com/office/word/2012/wordml" xmlns:wpg="http://schemas.microsoft.com/office/word/2010/wordprocessingGroup" xmlns:wpi="http://schemas.microsoft.com/office/word/2010/wordprocessingInk" xmlns:wne="http://schemas.microsoft.com/office/word/2006/wordml" xmlns:wps="http://schemas.microsoft.com/office/word/2010/wordprocessingShape" mc:Ignorable="w14 w15 wp14">
+  <w:abstractNum w:abstractNumId="0">
     <w:nsid w:val="17C06378"/>
     <w:multiLevelType w:val="hybridMultilevel"/>
     <w:tmpl w:val="49F0CEDA"/>
@@ -1360,7 +1199,7 @@
       </w:pPr>
     </w:lvl>
   </w:abstractNum>
-  <w:abstractNum w:abstractNumId="1" w15:restartNumberingAfterBreak="0">
+  <w:abstractNum w:abstractNumId="1">
     <w:nsid w:val="24E21EE1"/>
     <w:multiLevelType w:val="hybridMultilevel"/>
     <w:tmpl w:val="AB7681E6"/>
@@ -1449,7 +1288,7 @@
       </w:pPr>
     </w:lvl>
   </w:abstractNum>
-  <w:abstractNum w:abstractNumId="2" w15:restartNumberingAfterBreak="0">
+  <w:abstractNum w:abstractNumId="2">
     <w:nsid w:val="3AAC15ED"/>
     <w:multiLevelType w:val="hybridMultilevel"/>
     <w:tmpl w:val="AB7681E6"/>
@@ -1538,7 +1377,7 @@
       </w:pPr>
     </w:lvl>
   </w:abstractNum>
-  <w:abstractNum w:abstractNumId="3" w15:restartNumberingAfterBreak="0">
+  <w:abstractNum w:abstractNumId="3">
     <w:nsid w:val="681C43B0"/>
     <w:multiLevelType w:val="hybridMultilevel"/>
     <w:tmpl w:val="AB7681E6"/>
@@ -1627,26 +1466,26 @@
       </w:pPr>
     </w:lvl>
   </w:abstractNum>
-  <w:num w:numId="1" w16cid:durableId="1214269991">
+  <w:num w:numId="1">
     <w:abstractNumId w:val="0"/>
   </w:num>
-  <w:num w:numId="2" w16cid:durableId="760761174">
+  <w:num w:numId="2">
     <w:abstractNumId w:val="1"/>
   </w:num>
-  <w:num w:numId="3" w16cid:durableId="1696929653">
+  <w:num w:numId="3">
     <w:abstractNumId w:val="2"/>
   </w:num>
-  <w:num w:numId="4" w16cid:durableId="1603798934">
+  <w:num w:numId="4">
     <w:abstractNumId w:val="3"/>
   </w:num>
-  <w:num w:numId="5" w16cid:durableId="1248030602">
+  <w:num w:numId="5">
     <w:abstractNumId w:val="0"/>
   </w:num>
 </w:numbering>
 </file>
 
 <file path=word/styles.xml><?xml version="1.0" encoding="utf-8"?>
-<w:styles xmlns:mc="http://schemas.openxmlformats.org/markup-compatibility/2006" xmlns:r="http://schemas.openxmlformats.org/officeDocument/2006/relationships" xmlns:w="http://schemas.openxmlformats.org/wordprocessingml/2006/main" xmlns:w14="http://schemas.microsoft.com/office/word/2010/wordml" xmlns:w15="http://schemas.microsoft.com/office/word/2012/wordml" xmlns:w16cex="http://schemas.microsoft.com/office/word/2018/wordml/cex" xmlns:w16cid="http://schemas.microsoft.com/office/word/2016/wordml/cid" xmlns:w16="http://schemas.microsoft.com/office/word/2018/wordml" xmlns:w16du="http://schemas.microsoft.com/office/word/2023/wordml/word16du" xmlns:w16sdtdh="http://schemas.microsoft.com/office/word/2020/wordml/sdtdatahash" xmlns:w16sdtfl="http://schemas.microsoft.com/office/word/2024/wordml/sdtformatlock" xmlns:w16se="http://schemas.microsoft.com/office/word/2015/wordml/symex" mc:Ignorable="w14 w15 w16se w16cid w16 w16cex w16sdtdh w16sdtfl w16du">
+<w:styles xmlns:mc="http://schemas.openxmlformats.org/markup-compatibility/2006" xmlns:r="http://schemas.openxmlformats.org/officeDocument/2006/relationships" xmlns:w="http://schemas.openxmlformats.org/wordprocessingml/2006/main" xmlns:w14="http://schemas.microsoft.com/office/word/2010/wordml" xmlns:w15="http://schemas.microsoft.com/office/word/2012/wordml" mc:Ignorable="w14 w15">
   <w:docDefaults>
     <w:rPrDefault>
       <w:rPr>
@@ -1662,7 +1501,7 @@
       </w:pPr>
     </w:pPrDefault>
   </w:docDefaults>
-  <w:latentStyles w:defLockedState="0" w:defUIPriority="99" w:defSemiHidden="0" w:defUnhideWhenUsed="0" w:defQFormat="0" w:count="376">
+  <w:latentStyles w:defLockedState="0" w:defUIPriority="99" w:defSemiHidden="0" w:defUnhideWhenUsed="0" w:defQFormat="0" w:count="371">
     <w:lsdException w:name="Normal" w:uiPriority="0" w:qFormat="1"/>
     <w:lsdException w:name="heading 1" w:uiPriority="9" w:qFormat="1"/>
     <w:lsdException w:name="heading 2" w:semiHidden="1" w:uiPriority="9" w:unhideWhenUsed="1" w:qFormat="1"/>
@@ -2034,11 +1873,6 @@
     <w:lsdException w:name="List Table 5 Dark Accent 6" w:uiPriority="50"/>
     <w:lsdException w:name="List Table 6 Colorful Accent 6" w:uiPriority="51"/>
     <w:lsdException w:name="List Table 7 Colorful Accent 6" w:uiPriority="52"/>
-    <w:lsdException w:name="Mention" w:semiHidden="1" w:unhideWhenUsed="1"/>
-    <w:lsdException w:name="Smart Hyperlink" w:semiHidden="1" w:unhideWhenUsed="1"/>
-    <w:lsdException w:name="Hashtag" w:semiHidden="1" w:unhideWhenUsed="1"/>
-    <w:lsdException w:name="Unresolved Mention" w:semiHidden="1" w:unhideWhenUsed="1"/>
-    <w:lsdException w:name="Smart Link" w:semiHidden="1" w:unhideWhenUsed="1"/>
   </w:latentStyles>
   <w:style w:type="paragraph" w:default="1" w:styleId="Normal">
     <w:name w:val="Normal"/>
@@ -2160,6 +1994,7 @@
       <w:spacing w:after="0" w:line="240" w:lineRule="auto"/>
     </w:pPr>
     <w:tblPr>
+      <w:tblInd w:w="0" w:type="dxa"/>
       <w:tblBorders>
         <w:top w:val="single" w:sz="4" w:space="0" w:color="000000" w:themeColor="text1"/>
         <w:left w:val="single" w:sz="4" w:space="0" w:color="000000" w:themeColor="text1"/>
@@ -2168,6 +2003,12 @@
         <w:insideH w:val="single" w:sz="4" w:space="0" w:color="000000" w:themeColor="text1"/>
         <w:insideV w:val="single" w:sz="4" w:space="0" w:color="000000" w:themeColor="text1"/>
       </w:tblBorders>
+      <w:tblCellMar>
+        <w:top w:w="0" w:type="dxa"/>
+        <w:left w:w="108" w:type="dxa"/>
+        <w:bottom w:w="0" w:type="dxa"/>
+        <w:right w:w="108" w:type="dxa"/>
+      </w:tblCellMar>
     </w:tblPr>
   </w:style>
   <w:style w:type="paragraph" w:styleId="ListParagraph">
@@ -2497,7 +2338,7 @@
 </file>
 
 <file path=customXml/itemProps1.xml><?xml version="1.0" encoding="utf-8"?>
-<ds:datastoreItem xmlns:ds="http://schemas.openxmlformats.org/officeDocument/2006/customXml" ds:itemID="{02915F12-89C5-4618-AE8F-5621FE158444}">
+<ds:datastoreItem xmlns:ds="http://schemas.openxmlformats.org/officeDocument/2006/customXml" ds:itemID="{A7C55028-5B1A-4B16-BAC0-2527B5AC5D49}">
   <ds:schemaRefs>
     <ds:schemaRef ds:uri="http://schemas.openxmlformats.org/officeDocument/2006/bibliography"/>
   </ds:schemaRefs>

</xml_diff>